<commit_message>
chore: update content and layout for the sidang news report template
</commit_message>
<xml_diff>
--- a/public/template_berita_acara_sidang.docx
+++ b/public/template_berita_acara_sidang.docx
@@ -32,7 +32,7 @@
           <w:lang w:eastAsia="id-ID"/>
         </w:rPr>
         <w:drawing>
-          <wp:inline distT="0" distB="0" distL="0" distR="0" wp14:anchorId="64B94AB8" wp14:editId="7ADF1FC0">
+          <wp:inline distT="0" distB="0" distL="0" distR="0" wp14:anchorId="64B94AB8" wp14:editId="7D129E3A">
             <wp:extent cx="890270" cy="688340"/>
             <wp:effectExtent l="0" t="0" r="5080" b="0"/>
             <wp:docPr id="1614375618" name="Picture 1"/>
@@ -745,15 +745,6 @@
                 <w:rFonts w:ascii="Bookman Old Style" w:hAnsi="Bookman Old Style" w:cs="Arial"/>
               </w:rPr>
             </w:pPr>
-          </w:p>
-          <w:p>
-            <w:pPr>
-              <w:spacing w:after="0"/>
-              <w:jc w:val="center"/>
-              <w:rPr>
-                <w:rFonts w:ascii="Bookman Old Style" w:hAnsi="Bookman Old Style" w:cs="Arial"/>
-              </w:rPr>
-            </w:pPr>
             <w:r>
               <w:rPr>
                 <w:rFonts w:ascii="Bookman Old Style" w:hAnsi="Bookman Old Style" w:cs="Arial"/>
@@ -772,15 +763,6 @@
               </w:rPr>
               <w:t>}</w:t>
             </w:r>
-          </w:p>
-          <w:p>
-            <w:pPr>
-              <w:spacing w:after="0"/>
-              <w:jc w:val="center"/>
-              <w:rPr>
-                <w:rFonts w:ascii="Bookman Old Style" w:hAnsi="Bookman Old Style" w:cs="Arial"/>
-              </w:rPr>
-            </w:pPr>
           </w:p>
           <w:p>
             <w:pPr>

</xml_diff>